<commit_message>
docs: English Technical Specification + lab report (Lab 1)
- ЛР1_Technical_Specification_EN.docx — standalone GOST 19.106-78 spec (14 p.)
- ЛР1_Report_EN.docx — lab report in the example format (16 p.):
  Purpose / Task / Task completion (problem statement + full TS) /
  Conclusions / Control questions with answers
- generated by docs/build_en.py (python-docx), one script -> two documents

Co-Authored-By: Claude Opus 5 <noreply@anthropic.com>
</commit_message>
<xml_diff>
--- a/docs/ЛР1_Технічне_завдання.docx
+++ b/docs/ЛР1_Технічне_завдання.docx
@@ -62,8 +62,16 @@
         <w:rPr>
           <w:sz w:val="26"/>
         </w:rPr>
-        <w:t>Керівник ____________ Н. І. Праворська</w:t>
-      </w:r>
+        <w:t xml:space="preserve">Керівник ____________ Н. І. </w:t>
+      </w:r>
+      <w:proofErr w:type="spellStart"/>
+      <w:r>
+        <w:rPr>
+          <w:sz w:val="26"/>
+        </w:rPr>
+        <w:t>Праворська</w:t>
+      </w:r>
+      <w:proofErr w:type="spellEnd"/>
       <w:r>
         <w:br/>
       </w:r>
@@ -119,12 +127,21 @@
         <w:spacing w:after="360" w:line="240" w:lineRule="auto"/>
         <w:jc w:val="center"/>
       </w:pPr>
+      <w:proofErr w:type="spellStart"/>
       <w:r>
         <w:rPr>
           <w:b/>
           <w:sz w:val="32"/>
         </w:rPr>
-        <w:t>БпЛА ТА БОЄПРИПАСІВ</w:t>
+        <w:t>БпЛА</w:t>
+      </w:r>
+      <w:proofErr w:type="spellEnd"/>
+      <w:r>
+        <w:rPr>
+          <w:b/>
+          <w:sz w:val="32"/>
+        </w:rPr>
+        <w:t xml:space="preserve"> ТА БОЄПРИПАСІВ</w:t>
       </w:r>
     </w:p>
     <w:p>
@@ -218,8 +235,16 @@
         <w:rPr>
           <w:sz w:val="26"/>
         </w:rPr>
-        <w:t>Керівник: канд. пед. наук, доцент                      Н. І. Праворська</w:t>
-      </w:r>
+        <w:t xml:space="preserve">Керівник: канд. пед. наук, доцент                      Н. І. </w:t>
+      </w:r>
+      <w:proofErr w:type="spellStart"/>
+      <w:r>
+        <w:rPr>
+          <w:sz w:val="26"/>
+        </w:rPr>
+        <w:t>Праворська</w:t>
+      </w:r>
+      <w:proofErr w:type="spellEnd"/>
     </w:p>
     <w:p>
       <w:pPr>
@@ -295,11 +320,9 @@
         </w:tabs>
         <w:rPr>
           <w:rFonts w:asciiTheme="minorHAnsi" w:eastAsiaTheme="minorEastAsia" w:hAnsiTheme="minorHAnsi"/>
-          <w:noProof/>
           <w:kern w:val="2"/>
           <w:sz w:val="24"/>
           <w:szCs w:val="24"/>
-          <w:lang/>
           <w14:ligatures w14:val="standardContextual"/>
         </w:rPr>
       </w:pPr>
@@ -316,54 +339,46 @@
         <w:r>
           <w:rPr>
             <w:rStyle w:val="affa"/>
-            <w:noProof/>
           </w:rPr>
           <w:t>ПЕРЕЛІК ТЕРМІНІВ ТА СКОРОЧЕНЬ</w:t>
         </w:r>
         <w:r>
           <w:rPr>
-            <w:noProof/>
             <w:webHidden/>
           </w:rPr>
           <w:tab/>
         </w:r>
         <w:r>
           <w:rPr>
-            <w:noProof/>
             <w:webHidden/>
           </w:rPr>
           <w:fldChar w:fldCharType="begin"/>
         </w:r>
         <w:r>
           <w:rPr>
-            <w:noProof/>
             <w:webHidden/>
           </w:rPr>
           <w:instrText xml:space="preserve"> PAGEREF _Toc239527171 \h </w:instrText>
         </w:r>
         <w:r>
           <w:rPr>
-            <w:noProof/>
             <w:webHidden/>
           </w:rPr>
         </w:r>
         <w:r>
           <w:rPr>
-            <w:noProof/>
             <w:webHidden/>
           </w:rPr>
           <w:fldChar w:fldCharType="separate"/>
         </w:r>
         <w:r>
           <w:rPr>
-            <w:noProof/>
             <w:webHidden/>
           </w:rPr>
           <w:t>4</w:t>
         </w:r>
         <w:r>
           <w:rPr>
-            <w:noProof/>
             <w:webHidden/>
           </w:rPr>
           <w:fldChar w:fldCharType="end"/>
@@ -378,11 +393,9 @@
         </w:tabs>
         <w:rPr>
           <w:rFonts w:asciiTheme="minorHAnsi" w:eastAsiaTheme="minorEastAsia" w:hAnsiTheme="minorHAnsi"/>
-          <w:noProof/>
           <w:kern w:val="2"/>
           <w:sz w:val="24"/>
           <w:szCs w:val="24"/>
-          <w:lang/>
           <w14:ligatures w14:val="standardContextual"/>
         </w:rPr>
       </w:pPr>
@@ -390,54 +403,46 @@
         <w:r>
           <w:rPr>
             <w:rStyle w:val="affa"/>
-            <w:noProof/>
           </w:rPr>
           <w:t>ВСТУП</w:t>
         </w:r>
         <w:r>
           <w:rPr>
-            <w:noProof/>
             <w:webHidden/>
           </w:rPr>
           <w:tab/>
         </w:r>
         <w:r>
           <w:rPr>
-            <w:noProof/>
             <w:webHidden/>
           </w:rPr>
           <w:fldChar w:fldCharType="begin"/>
         </w:r>
         <w:r>
           <w:rPr>
-            <w:noProof/>
             <w:webHidden/>
           </w:rPr>
           <w:instrText xml:space="preserve"> PAGEREF _Toc239527172 \h </w:instrText>
         </w:r>
         <w:r>
           <w:rPr>
-            <w:noProof/>
             <w:webHidden/>
           </w:rPr>
         </w:r>
         <w:r>
           <w:rPr>
-            <w:noProof/>
             <w:webHidden/>
           </w:rPr>
           <w:fldChar w:fldCharType="separate"/>
         </w:r>
         <w:r>
           <w:rPr>
-            <w:noProof/>
             <w:webHidden/>
           </w:rPr>
           <w:t>5</w:t>
         </w:r>
         <w:r>
           <w:rPr>
-            <w:noProof/>
             <w:webHidden/>
           </w:rPr>
           <w:fldChar w:fldCharType="end"/>
@@ -452,11 +457,9 @@
         </w:tabs>
         <w:rPr>
           <w:rFonts w:asciiTheme="minorHAnsi" w:eastAsiaTheme="minorEastAsia" w:hAnsiTheme="minorHAnsi"/>
-          <w:noProof/>
           <w:kern w:val="2"/>
           <w:sz w:val="24"/>
           <w:szCs w:val="24"/>
-          <w:lang/>
           <w14:ligatures w14:val="standardContextual"/>
         </w:rPr>
       </w:pPr>
@@ -464,54 +467,46 @@
         <w:r>
           <w:rPr>
             <w:rStyle w:val="affa"/>
-            <w:noProof/>
           </w:rPr>
           <w:t>1 НАЙМЕНУВАННЯ ТА ОБЛАСТЬ ЗАСТОСУВАННЯ</w:t>
         </w:r>
         <w:r>
           <w:rPr>
-            <w:noProof/>
             <w:webHidden/>
           </w:rPr>
           <w:tab/>
         </w:r>
         <w:r>
           <w:rPr>
-            <w:noProof/>
             <w:webHidden/>
           </w:rPr>
           <w:fldChar w:fldCharType="begin"/>
         </w:r>
         <w:r>
           <w:rPr>
-            <w:noProof/>
             <w:webHidden/>
           </w:rPr>
           <w:instrText xml:space="preserve"> PAGEREF _Toc239527173 \h </w:instrText>
         </w:r>
         <w:r>
           <w:rPr>
-            <w:noProof/>
             <w:webHidden/>
           </w:rPr>
         </w:r>
         <w:r>
           <w:rPr>
-            <w:noProof/>
             <w:webHidden/>
           </w:rPr>
           <w:fldChar w:fldCharType="separate"/>
         </w:r>
         <w:r>
           <w:rPr>
-            <w:noProof/>
             <w:webHidden/>
           </w:rPr>
           <w:t>5</w:t>
         </w:r>
         <w:r>
           <w:rPr>
-            <w:noProof/>
             <w:webHidden/>
           </w:rPr>
           <w:fldChar w:fldCharType="end"/>
@@ -526,11 +521,9 @@
         </w:tabs>
         <w:rPr>
           <w:rFonts w:asciiTheme="minorHAnsi" w:eastAsiaTheme="minorEastAsia" w:hAnsiTheme="minorHAnsi"/>
-          <w:noProof/>
           <w:kern w:val="2"/>
           <w:sz w:val="24"/>
           <w:szCs w:val="24"/>
-          <w:lang/>
           <w14:ligatures w14:val="standardContextual"/>
         </w:rPr>
       </w:pPr>
@@ -538,54 +531,46 @@
         <w:r>
           <w:rPr>
             <w:rStyle w:val="affa"/>
-            <w:noProof/>
           </w:rPr>
           <w:t>2 ПІДСТАВА ДЛЯ РОЗРОБКИ</w:t>
         </w:r>
         <w:r>
           <w:rPr>
-            <w:noProof/>
             <w:webHidden/>
           </w:rPr>
           <w:tab/>
         </w:r>
         <w:r>
           <w:rPr>
-            <w:noProof/>
             <w:webHidden/>
           </w:rPr>
           <w:fldChar w:fldCharType="begin"/>
         </w:r>
         <w:r>
           <w:rPr>
-            <w:noProof/>
             <w:webHidden/>
           </w:rPr>
           <w:instrText xml:space="preserve"> PAGEREF _Toc239527174 \h </w:instrText>
         </w:r>
         <w:r>
           <w:rPr>
-            <w:noProof/>
             <w:webHidden/>
           </w:rPr>
         </w:r>
         <w:r>
           <w:rPr>
-            <w:noProof/>
             <w:webHidden/>
           </w:rPr>
           <w:fldChar w:fldCharType="separate"/>
         </w:r>
         <w:r>
           <w:rPr>
-            <w:noProof/>
             <w:webHidden/>
           </w:rPr>
           <w:t>6</w:t>
         </w:r>
         <w:r>
           <w:rPr>
-            <w:noProof/>
             <w:webHidden/>
           </w:rPr>
           <w:fldChar w:fldCharType="end"/>
@@ -600,11 +585,9 @@
         </w:tabs>
         <w:rPr>
           <w:rFonts w:asciiTheme="minorHAnsi" w:eastAsiaTheme="minorEastAsia" w:hAnsiTheme="minorHAnsi"/>
-          <w:noProof/>
           <w:kern w:val="2"/>
           <w:sz w:val="24"/>
           <w:szCs w:val="24"/>
-          <w:lang/>
           <w14:ligatures w14:val="standardContextual"/>
         </w:rPr>
       </w:pPr>
@@ -612,54 +595,46 @@
         <w:r>
           <w:rPr>
             <w:rStyle w:val="affa"/>
-            <w:noProof/>
           </w:rPr>
           <w:t>3 ПРИЗНАЧЕННЯ РОЗРОБКИ</w:t>
         </w:r>
         <w:r>
           <w:rPr>
-            <w:noProof/>
             <w:webHidden/>
           </w:rPr>
           <w:tab/>
         </w:r>
         <w:r>
           <w:rPr>
-            <w:noProof/>
             <w:webHidden/>
           </w:rPr>
           <w:fldChar w:fldCharType="begin"/>
         </w:r>
         <w:r>
           <w:rPr>
-            <w:noProof/>
             <w:webHidden/>
           </w:rPr>
           <w:instrText xml:space="preserve"> PAGEREF _Toc239527175 \h </w:instrText>
         </w:r>
         <w:r>
           <w:rPr>
-            <w:noProof/>
             <w:webHidden/>
           </w:rPr>
         </w:r>
         <w:r>
           <w:rPr>
-            <w:noProof/>
             <w:webHidden/>
           </w:rPr>
           <w:fldChar w:fldCharType="separate"/>
         </w:r>
         <w:r>
           <w:rPr>
-            <w:noProof/>
             <w:webHidden/>
           </w:rPr>
           <w:t>6</w:t>
         </w:r>
         <w:r>
           <w:rPr>
-            <w:noProof/>
             <w:webHidden/>
           </w:rPr>
           <w:fldChar w:fldCharType="end"/>
@@ -674,11 +649,9 @@
         </w:tabs>
         <w:rPr>
           <w:rFonts w:asciiTheme="minorHAnsi" w:eastAsiaTheme="minorEastAsia" w:hAnsiTheme="minorHAnsi"/>
-          <w:noProof/>
           <w:kern w:val="2"/>
           <w:sz w:val="24"/>
           <w:szCs w:val="24"/>
-          <w:lang/>
           <w14:ligatures w14:val="standardContextual"/>
         </w:rPr>
       </w:pPr>
@@ -686,54 +659,46 @@
         <w:r>
           <w:rPr>
             <w:rStyle w:val="affa"/>
-            <w:noProof/>
           </w:rPr>
           <w:t>3.1 Функціональне призначення</w:t>
         </w:r>
         <w:r>
           <w:rPr>
-            <w:noProof/>
             <w:webHidden/>
           </w:rPr>
           <w:tab/>
         </w:r>
         <w:r>
           <w:rPr>
-            <w:noProof/>
             <w:webHidden/>
           </w:rPr>
           <w:fldChar w:fldCharType="begin"/>
         </w:r>
         <w:r>
           <w:rPr>
-            <w:noProof/>
             <w:webHidden/>
           </w:rPr>
           <w:instrText xml:space="preserve"> PAGEREF _Toc239527176 \h </w:instrText>
         </w:r>
         <w:r>
           <w:rPr>
-            <w:noProof/>
             <w:webHidden/>
           </w:rPr>
         </w:r>
         <w:r>
           <w:rPr>
-            <w:noProof/>
             <w:webHidden/>
           </w:rPr>
           <w:fldChar w:fldCharType="separate"/>
         </w:r>
         <w:r>
           <w:rPr>
-            <w:noProof/>
             <w:webHidden/>
           </w:rPr>
           <w:t>6</w:t>
         </w:r>
         <w:r>
           <w:rPr>
-            <w:noProof/>
             <w:webHidden/>
           </w:rPr>
           <w:fldChar w:fldCharType="end"/>
@@ -748,11 +713,9 @@
         </w:tabs>
         <w:rPr>
           <w:rFonts w:asciiTheme="minorHAnsi" w:eastAsiaTheme="minorEastAsia" w:hAnsiTheme="minorHAnsi"/>
-          <w:noProof/>
           <w:kern w:val="2"/>
           <w:sz w:val="24"/>
           <w:szCs w:val="24"/>
-          <w:lang/>
           <w14:ligatures w14:val="standardContextual"/>
         </w:rPr>
       </w:pPr>
@@ -760,54 +723,46 @@
         <w:r>
           <w:rPr>
             <w:rStyle w:val="affa"/>
-            <w:noProof/>
           </w:rPr>
           <w:t>3.2 Експлуатаційне призначення</w:t>
         </w:r>
         <w:r>
           <w:rPr>
-            <w:noProof/>
             <w:webHidden/>
           </w:rPr>
           <w:tab/>
         </w:r>
         <w:r>
           <w:rPr>
-            <w:noProof/>
             <w:webHidden/>
           </w:rPr>
           <w:fldChar w:fldCharType="begin"/>
         </w:r>
         <w:r>
           <w:rPr>
-            <w:noProof/>
             <w:webHidden/>
           </w:rPr>
           <w:instrText xml:space="preserve"> PAGEREF _Toc239527177 \h </w:instrText>
         </w:r>
         <w:r>
           <w:rPr>
-            <w:noProof/>
             <w:webHidden/>
           </w:rPr>
         </w:r>
         <w:r>
           <w:rPr>
-            <w:noProof/>
             <w:webHidden/>
           </w:rPr>
           <w:fldChar w:fldCharType="separate"/>
         </w:r>
         <w:r>
           <w:rPr>
-            <w:noProof/>
             <w:webHidden/>
           </w:rPr>
           <w:t>6</w:t>
         </w:r>
         <w:r>
           <w:rPr>
-            <w:noProof/>
             <w:webHidden/>
           </w:rPr>
           <w:fldChar w:fldCharType="end"/>
@@ -822,11 +777,9 @@
         </w:tabs>
         <w:rPr>
           <w:rFonts w:asciiTheme="minorHAnsi" w:eastAsiaTheme="minorEastAsia" w:hAnsiTheme="minorHAnsi"/>
-          <w:noProof/>
           <w:kern w:val="2"/>
           <w:sz w:val="24"/>
           <w:szCs w:val="24"/>
-          <w:lang/>
           <w14:ligatures w14:val="standardContextual"/>
         </w:rPr>
       </w:pPr>
@@ -834,54 +787,46 @@
         <w:r>
           <w:rPr>
             <w:rStyle w:val="affa"/>
-            <w:noProof/>
           </w:rPr>
           <w:t>4 ТЕХНІЧНІ ВИМОГИ ДО ПРОГРАМНОГО ПРОДУКТУ</w:t>
         </w:r>
         <w:r>
           <w:rPr>
-            <w:noProof/>
             <w:webHidden/>
           </w:rPr>
           <w:tab/>
         </w:r>
         <w:r>
           <w:rPr>
-            <w:noProof/>
             <w:webHidden/>
           </w:rPr>
           <w:fldChar w:fldCharType="begin"/>
         </w:r>
         <w:r>
           <w:rPr>
-            <w:noProof/>
             <w:webHidden/>
           </w:rPr>
           <w:instrText xml:space="preserve"> PAGEREF _Toc239527178 \h </w:instrText>
         </w:r>
         <w:r>
           <w:rPr>
-            <w:noProof/>
             <w:webHidden/>
           </w:rPr>
         </w:r>
         <w:r>
           <w:rPr>
-            <w:noProof/>
             <w:webHidden/>
           </w:rPr>
           <w:fldChar w:fldCharType="separate"/>
         </w:r>
         <w:r>
           <w:rPr>
-            <w:noProof/>
             <w:webHidden/>
           </w:rPr>
           <w:t>7</w:t>
         </w:r>
         <w:r>
           <w:rPr>
-            <w:noProof/>
             <w:webHidden/>
           </w:rPr>
           <w:fldChar w:fldCharType="end"/>
@@ -896,11 +841,9 @@
         </w:tabs>
         <w:rPr>
           <w:rFonts w:asciiTheme="minorHAnsi" w:eastAsiaTheme="minorEastAsia" w:hAnsiTheme="minorHAnsi"/>
-          <w:noProof/>
           <w:kern w:val="2"/>
           <w:sz w:val="24"/>
           <w:szCs w:val="24"/>
-          <w:lang/>
           <w14:ligatures w14:val="standardContextual"/>
         </w:rPr>
       </w:pPr>
@@ -908,54 +851,46 @@
         <w:r>
           <w:rPr>
             <w:rStyle w:val="affa"/>
-            <w:noProof/>
           </w:rPr>
           <w:t>4.1 Вимоги до функціональних характеристик</w:t>
         </w:r>
         <w:r>
           <w:rPr>
-            <w:noProof/>
             <w:webHidden/>
           </w:rPr>
           <w:tab/>
         </w:r>
         <w:r>
           <w:rPr>
-            <w:noProof/>
             <w:webHidden/>
           </w:rPr>
           <w:fldChar w:fldCharType="begin"/>
         </w:r>
         <w:r>
           <w:rPr>
-            <w:noProof/>
             <w:webHidden/>
           </w:rPr>
           <w:instrText xml:space="preserve"> PAGEREF _Toc239527179 \h </w:instrText>
         </w:r>
         <w:r>
           <w:rPr>
-            <w:noProof/>
             <w:webHidden/>
           </w:rPr>
         </w:r>
         <w:r>
           <w:rPr>
-            <w:noProof/>
             <w:webHidden/>
           </w:rPr>
           <w:fldChar w:fldCharType="separate"/>
         </w:r>
         <w:r>
           <w:rPr>
-            <w:noProof/>
             <w:webHidden/>
           </w:rPr>
           <w:t>7</w:t>
         </w:r>
         <w:r>
           <w:rPr>
-            <w:noProof/>
             <w:webHidden/>
           </w:rPr>
           <w:fldChar w:fldCharType="end"/>
@@ -970,11 +905,9 @@
         </w:tabs>
         <w:rPr>
           <w:rFonts w:asciiTheme="minorHAnsi" w:eastAsiaTheme="minorEastAsia" w:hAnsiTheme="minorHAnsi"/>
-          <w:noProof/>
           <w:kern w:val="2"/>
           <w:sz w:val="24"/>
           <w:szCs w:val="24"/>
-          <w:lang/>
           <w14:ligatures w14:val="standardContextual"/>
         </w:rPr>
       </w:pPr>
@@ -983,54 +916,46 @@
           <w:rPr>
             <w:rStyle w:val="affa"/>
             <w:i/>
-            <w:noProof/>
           </w:rPr>
           <w:t>4.1.1 Склад виконуваних функцій</w:t>
         </w:r>
         <w:r>
           <w:rPr>
-            <w:noProof/>
             <w:webHidden/>
           </w:rPr>
           <w:tab/>
         </w:r>
         <w:r>
           <w:rPr>
-            <w:noProof/>
             <w:webHidden/>
           </w:rPr>
           <w:fldChar w:fldCharType="begin"/>
         </w:r>
         <w:r>
           <w:rPr>
-            <w:noProof/>
             <w:webHidden/>
           </w:rPr>
           <w:instrText xml:space="preserve"> PAGEREF _Toc239527180 \h </w:instrText>
         </w:r>
         <w:r>
           <w:rPr>
-            <w:noProof/>
             <w:webHidden/>
           </w:rPr>
         </w:r>
         <w:r>
           <w:rPr>
-            <w:noProof/>
             <w:webHidden/>
           </w:rPr>
           <w:fldChar w:fldCharType="separate"/>
         </w:r>
         <w:r>
           <w:rPr>
-            <w:noProof/>
             <w:webHidden/>
           </w:rPr>
           <w:t>7</w:t>
         </w:r>
         <w:r>
           <w:rPr>
-            <w:noProof/>
             <w:webHidden/>
           </w:rPr>
           <w:fldChar w:fldCharType="end"/>
@@ -1045,11 +970,9 @@
         </w:tabs>
         <w:rPr>
           <w:rFonts w:asciiTheme="minorHAnsi" w:eastAsiaTheme="minorEastAsia" w:hAnsiTheme="minorHAnsi"/>
-          <w:noProof/>
           <w:kern w:val="2"/>
           <w:sz w:val="24"/>
           <w:szCs w:val="24"/>
-          <w:lang/>
           <w14:ligatures w14:val="standardContextual"/>
         </w:rPr>
       </w:pPr>
@@ -1058,54 +981,46 @@
           <w:rPr>
             <w:rStyle w:val="affa"/>
             <w:i/>
-            <w:noProof/>
           </w:rPr>
           <w:t>4.1.2 Організація вхідних і вихідних даних</w:t>
         </w:r>
         <w:r>
           <w:rPr>
-            <w:noProof/>
             <w:webHidden/>
           </w:rPr>
           <w:tab/>
         </w:r>
         <w:r>
           <w:rPr>
-            <w:noProof/>
             <w:webHidden/>
           </w:rPr>
           <w:fldChar w:fldCharType="begin"/>
         </w:r>
         <w:r>
           <w:rPr>
-            <w:noProof/>
             <w:webHidden/>
           </w:rPr>
           <w:instrText xml:space="preserve"> PAGEREF _Toc239527181 \h </w:instrText>
         </w:r>
         <w:r>
           <w:rPr>
-            <w:noProof/>
             <w:webHidden/>
           </w:rPr>
         </w:r>
         <w:r>
           <w:rPr>
-            <w:noProof/>
             <w:webHidden/>
           </w:rPr>
           <w:fldChar w:fldCharType="separate"/>
         </w:r>
         <w:r>
           <w:rPr>
-            <w:noProof/>
             <w:webHidden/>
           </w:rPr>
           <w:t>8</w:t>
         </w:r>
         <w:r>
           <w:rPr>
-            <w:noProof/>
             <w:webHidden/>
           </w:rPr>
           <w:fldChar w:fldCharType="end"/>
@@ -1120,11 +1035,9 @@
         </w:tabs>
         <w:rPr>
           <w:rFonts w:asciiTheme="minorHAnsi" w:eastAsiaTheme="minorEastAsia" w:hAnsiTheme="minorHAnsi"/>
-          <w:noProof/>
           <w:kern w:val="2"/>
           <w:sz w:val="24"/>
           <w:szCs w:val="24"/>
-          <w:lang/>
           <w14:ligatures w14:val="standardContextual"/>
         </w:rPr>
       </w:pPr>
@@ -1133,54 +1046,46 @@
           <w:rPr>
             <w:rStyle w:val="affa"/>
             <w:i/>
-            <w:noProof/>
           </w:rPr>
           <w:t>4.1.3 Часові характеристики</w:t>
         </w:r>
         <w:r>
           <w:rPr>
-            <w:noProof/>
             <w:webHidden/>
           </w:rPr>
           <w:tab/>
         </w:r>
         <w:r>
           <w:rPr>
-            <w:noProof/>
             <w:webHidden/>
           </w:rPr>
           <w:fldChar w:fldCharType="begin"/>
         </w:r>
         <w:r>
           <w:rPr>
-            <w:noProof/>
             <w:webHidden/>
           </w:rPr>
           <w:instrText xml:space="preserve"> PAGEREF _Toc239527182 \h </w:instrText>
         </w:r>
         <w:r>
           <w:rPr>
-            <w:noProof/>
             <w:webHidden/>
           </w:rPr>
         </w:r>
         <w:r>
           <w:rPr>
-            <w:noProof/>
             <w:webHidden/>
           </w:rPr>
           <w:fldChar w:fldCharType="separate"/>
         </w:r>
         <w:r>
           <w:rPr>
-            <w:noProof/>
             <w:webHidden/>
           </w:rPr>
           <w:t>8</w:t>
         </w:r>
         <w:r>
           <w:rPr>
-            <w:noProof/>
             <w:webHidden/>
           </w:rPr>
           <w:fldChar w:fldCharType="end"/>
@@ -1195,11 +1100,9 @@
         </w:tabs>
         <w:rPr>
           <w:rFonts w:asciiTheme="minorHAnsi" w:eastAsiaTheme="minorEastAsia" w:hAnsiTheme="minorHAnsi"/>
-          <w:noProof/>
           <w:kern w:val="2"/>
           <w:sz w:val="24"/>
           <w:szCs w:val="24"/>
-          <w:lang/>
           <w14:ligatures w14:val="standardContextual"/>
         </w:rPr>
       </w:pPr>
@@ -1207,54 +1110,46 @@
         <w:r>
           <w:rPr>
             <w:rStyle w:val="affa"/>
-            <w:noProof/>
           </w:rPr>
           <w:t>4.2 Вимоги до надійності</w:t>
         </w:r>
         <w:r>
           <w:rPr>
-            <w:noProof/>
             <w:webHidden/>
           </w:rPr>
           <w:tab/>
         </w:r>
         <w:r>
           <w:rPr>
-            <w:noProof/>
             <w:webHidden/>
           </w:rPr>
           <w:fldChar w:fldCharType="begin"/>
         </w:r>
         <w:r>
           <w:rPr>
-            <w:noProof/>
             <w:webHidden/>
           </w:rPr>
           <w:instrText xml:space="preserve"> PAGEREF _Toc239527183 \h </w:instrText>
         </w:r>
         <w:r>
           <w:rPr>
-            <w:noProof/>
             <w:webHidden/>
           </w:rPr>
         </w:r>
         <w:r>
           <w:rPr>
-            <w:noProof/>
             <w:webHidden/>
           </w:rPr>
           <w:fldChar w:fldCharType="separate"/>
         </w:r>
         <w:r>
           <w:rPr>
-            <w:noProof/>
             <w:webHidden/>
           </w:rPr>
           <w:t>9</w:t>
         </w:r>
         <w:r>
           <w:rPr>
-            <w:noProof/>
             <w:webHidden/>
           </w:rPr>
           <w:fldChar w:fldCharType="end"/>
@@ -1269,11 +1164,9 @@
         </w:tabs>
         <w:rPr>
           <w:rFonts w:asciiTheme="minorHAnsi" w:eastAsiaTheme="minorEastAsia" w:hAnsiTheme="minorHAnsi"/>
-          <w:noProof/>
           <w:kern w:val="2"/>
           <w:sz w:val="24"/>
           <w:szCs w:val="24"/>
-          <w:lang/>
           <w14:ligatures w14:val="standardContextual"/>
         </w:rPr>
       </w:pPr>
@@ -1281,54 +1174,46 @@
         <w:r>
           <w:rPr>
             <w:rStyle w:val="affa"/>
-            <w:noProof/>
           </w:rPr>
           <w:t>4.3 Умови експлуатації</w:t>
         </w:r>
         <w:r>
           <w:rPr>
-            <w:noProof/>
             <w:webHidden/>
           </w:rPr>
           <w:tab/>
         </w:r>
         <w:r>
           <w:rPr>
-            <w:noProof/>
             <w:webHidden/>
           </w:rPr>
           <w:fldChar w:fldCharType="begin"/>
         </w:r>
         <w:r>
           <w:rPr>
-            <w:noProof/>
             <w:webHidden/>
           </w:rPr>
           <w:instrText xml:space="preserve"> PAGEREF _Toc239527184 \h </w:instrText>
         </w:r>
         <w:r>
           <w:rPr>
-            <w:noProof/>
             <w:webHidden/>
           </w:rPr>
         </w:r>
         <w:r>
           <w:rPr>
-            <w:noProof/>
             <w:webHidden/>
           </w:rPr>
           <w:fldChar w:fldCharType="separate"/>
         </w:r>
         <w:r>
           <w:rPr>
-            <w:noProof/>
             <w:webHidden/>
           </w:rPr>
           <w:t>9</w:t>
         </w:r>
         <w:r>
           <w:rPr>
-            <w:noProof/>
             <w:webHidden/>
           </w:rPr>
           <w:fldChar w:fldCharType="end"/>
@@ -1343,11 +1228,9 @@
         </w:tabs>
         <w:rPr>
           <w:rFonts w:asciiTheme="minorHAnsi" w:eastAsiaTheme="minorEastAsia" w:hAnsiTheme="minorHAnsi"/>
-          <w:noProof/>
           <w:kern w:val="2"/>
           <w:sz w:val="24"/>
           <w:szCs w:val="24"/>
-          <w:lang/>
           <w14:ligatures w14:val="standardContextual"/>
         </w:rPr>
       </w:pPr>
@@ -1355,54 +1238,46 @@
         <w:r>
           <w:rPr>
             <w:rStyle w:val="affa"/>
-            <w:noProof/>
           </w:rPr>
           <w:t>4.4 Вимоги до складу й параметрів технічних засобів</w:t>
         </w:r>
         <w:r>
           <w:rPr>
-            <w:noProof/>
             <w:webHidden/>
           </w:rPr>
           <w:tab/>
         </w:r>
         <w:r>
           <w:rPr>
-            <w:noProof/>
             <w:webHidden/>
           </w:rPr>
           <w:fldChar w:fldCharType="begin"/>
         </w:r>
         <w:r>
           <w:rPr>
-            <w:noProof/>
             <w:webHidden/>
           </w:rPr>
           <w:instrText xml:space="preserve"> PAGEREF _Toc239527185 \h </w:instrText>
         </w:r>
         <w:r>
           <w:rPr>
-            <w:noProof/>
             <w:webHidden/>
           </w:rPr>
         </w:r>
         <w:r>
           <w:rPr>
-            <w:noProof/>
             <w:webHidden/>
           </w:rPr>
           <w:fldChar w:fldCharType="separate"/>
         </w:r>
         <w:r>
           <w:rPr>
-            <w:noProof/>
             <w:webHidden/>
           </w:rPr>
           <w:t>9</w:t>
         </w:r>
         <w:r>
           <w:rPr>
-            <w:noProof/>
             <w:webHidden/>
           </w:rPr>
           <w:fldChar w:fldCharType="end"/>
@@ -1417,11 +1292,9 @@
         </w:tabs>
         <w:rPr>
           <w:rFonts w:asciiTheme="minorHAnsi" w:eastAsiaTheme="minorEastAsia" w:hAnsiTheme="minorHAnsi"/>
-          <w:noProof/>
           <w:kern w:val="2"/>
           <w:sz w:val="24"/>
           <w:szCs w:val="24"/>
-          <w:lang/>
           <w14:ligatures w14:val="standardContextual"/>
         </w:rPr>
       </w:pPr>
@@ -1429,54 +1302,46 @@
         <w:r>
           <w:rPr>
             <w:rStyle w:val="affa"/>
-            <w:noProof/>
           </w:rPr>
           <w:t>4.5 Вимоги до інформаційної й програмної сумісності</w:t>
         </w:r>
         <w:r>
           <w:rPr>
-            <w:noProof/>
             <w:webHidden/>
           </w:rPr>
           <w:tab/>
         </w:r>
         <w:r>
           <w:rPr>
-            <w:noProof/>
             <w:webHidden/>
           </w:rPr>
           <w:fldChar w:fldCharType="begin"/>
         </w:r>
         <w:r>
           <w:rPr>
-            <w:noProof/>
             <w:webHidden/>
           </w:rPr>
           <w:instrText xml:space="preserve"> PAGEREF _Toc239527186 \h </w:instrText>
         </w:r>
         <w:r>
           <w:rPr>
-            <w:noProof/>
             <w:webHidden/>
           </w:rPr>
         </w:r>
         <w:r>
           <w:rPr>
-            <w:noProof/>
             <w:webHidden/>
           </w:rPr>
           <w:fldChar w:fldCharType="separate"/>
         </w:r>
         <w:r>
           <w:rPr>
-            <w:noProof/>
             <w:webHidden/>
           </w:rPr>
           <w:t>10</w:t>
         </w:r>
         <w:r>
           <w:rPr>
-            <w:noProof/>
             <w:webHidden/>
           </w:rPr>
           <w:fldChar w:fldCharType="end"/>
@@ -1491,11 +1356,9 @@
         </w:tabs>
         <w:rPr>
           <w:rFonts w:asciiTheme="minorHAnsi" w:eastAsiaTheme="minorEastAsia" w:hAnsiTheme="minorHAnsi"/>
-          <w:noProof/>
           <w:kern w:val="2"/>
           <w:sz w:val="24"/>
           <w:szCs w:val="24"/>
-          <w:lang/>
           <w14:ligatures w14:val="standardContextual"/>
         </w:rPr>
       </w:pPr>
@@ -1503,54 +1366,46 @@
         <w:r>
           <w:rPr>
             <w:rStyle w:val="affa"/>
-            <w:noProof/>
           </w:rPr>
           <w:t>4.6 Вимоги до маркування й упакування</w:t>
         </w:r>
         <w:r>
           <w:rPr>
-            <w:noProof/>
             <w:webHidden/>
           </w:rPr>
           <w:tab/>
         </w:r>
         <w:r>
           <w:rPr>
-            <w:noProof/>
             <w:webHidden/>
           </w:rPr>
           <w:fldChar w:fldCharType="begin"/>
         </w:r>
         <w:r>
           <w:rPr>
-            <w:noProof/>
             <w:webHidden/>
           </w:rPr>
           <w:instrText xml:space="preserve"> PAGEREF _Toc239527187 \h </w:instrText>
         </w:r>
         <w:r>
           <w:rPr>
-            <w:noProof/>
             <w:webHidden/>
           </w:rPr>
         </w:r>
         <w:r>
           <w:rPr>
-            <w:noProof/>
             <w:webHidden/>
           </w:rPr>
           <w:fldChar w:fldCharType="separate"/>
         </w:r>
         <w:r>
           <w:rPr>
-            <w:noProof/>
             <w:webHidden/>
           </w:rPr>
           <w:t>10</w:t>
         </w:r>
         <w:r>
           <w:rPr>
-            <w:noProof/>
             <w:webHidden/>
           </w:rPr>
           <w:fldChar w:fldCharType="end"/>
@@ -1565,11 +1420,9 @@
         </w:tabs>
         <w:rPr>
           <w:rFonts w:asciiTheme="minorHAnsi" w:eastAsiaTheme="minorEastAsia" w:hAnsiTheme="minorHAnsi"/>
-          <w:noProof/>
           <w:kern w:val="2"/>
           <w:sz w:val="24"/>
           <w:szCs w:val="24"/>
-          <w:lang/>
           <w14:ligatures w14:val="standardContextual"/>
         </w:rPr>
       </w:pPr>
@@ -1577,54 +1430,46 @@
         <w:r>
           <w:rPr>
             <w:rStyle w:val="affa"/>
-            <w:noProof/>
           </w:rPr>
           <w:t>4.7 Вимоги до транспортування й зберігання</w:t>
         </w:r>
         <w:r>
           <w:rPr>
-            <w:noProof/>
             <w:webHidden/>
           </w:rPr>
           <w:tab/>
         </w:r>
         <w:r>
           <w:rPr>
-            <w:noProof/>
             <w:webHidden/>
           </w:rPr>
           <w:fldChar w:fldCharType="begin"/>
         </w:r>
         <w:r>
           <w:rPr>
-            <w:noProof/>
             <w:webHidden/>
           </w:rPr>
           <w:instrText xml:space="preserve"> PAGEREF _Toc239527188 \h </w:instrText>
         </w:r>
         <w:r>
           <w:rPr>
-            <w:noProof/>
             <w:webHidden/>
           </w:rPr>
         </w:r>
         <w:r>
           <w:rPr>
-            <w:noProof/>
             <w:webHidden/>
           </w:rPr>
           <w:fldChar w:fldCharType="separate"/>
         </w:r>
         <w:r>
           <w:rPr>
-            <w:noProof/>
             <w:webHidden/>
           </w:rPr>
           <w:t>11</w:t>
         </w:r>
         <w:r>
           <w:rPr>
-            <w:noProof/>
             <w:webHidden/>
           </w:rPr>
           <w:fldChar w:fldCharType="end"/>
@@ -1639,11 +1484,9 @@
         </w:tabs>
         <w:rPr>
           <w:rFonts w:asciiTheme="minorHAnsi" w:eastAsiaTheme="minorEastAsia" w:hAnsiTheme="minorHAnsi"/>
-          <w:noProof/>
           <w:kern w:val="2"/>
           <w:sz w:val="24"/>
           <w:szCs w:val="24"/>
-          <w:lang/>
           <w14:ligatures w14:val="standardContextual"/>
         </w:rPr>
       </w:pPr>
@@ -1651,54 +1494,46 @@
         <w:r>
           <w:rPr>
             <w:rStyle w:val="affa"/>
-            <w:noProof/>
           </w:rPr>
           <w:t>4.8 Спеціальні вимоги</w:t>
         </w:r>
         <w:r>
           <w:rPr>
-            <w:noProof/>
             <w:webHidden/>
           </w:rPr>
           <w:tab/>
         </w:r>
         <w:r>
           <w:rPr>
-            <w:noProof/>
             <w:webHidden/>
           </w:rPr>
           <w:fldChar w:fldCharType="begin"/>
         </w:r>
         <w:r>
           <w:rPr>
-            <w:noProof/>
             <w:webHidden/>
           </w:rPr>
           <w:instrText xml:space="preserve"> PAGEREF _Toc239527189 \h </w:instrText>
         </w:r>
         <w:r>
           <w:rPr>
-            <w:noProof/>
             <w:webHidden/>
           </w:rPr>
         </w:r>
         <w:r>
           <w:rPr>
-            <w:noProof/>
             <w:webHidden/>
           </w:rPr>
           <w:fldChar w:fldCharType="separate"/>
         </w:r>
         <w:r>
           <w:rPr>
-            <w:noProof/>
             <w:webHidden/>
           </w:rPr>
           <w:t>11</w:t>
         </w:r>
         <w:r>
           <w:rPr>
-            <w:noProof/>
             <w:webHidden/>
           </w:rPr>
           <w:fldChar w:fldCharType="end"/>
@@ -1713,11 +1548,9 @@
         </w:tabs>
         <w:rPr>
           <w:rFonts w:asciiTheme="minorHAnsi" w:eastAsiaTheme="minorEastAsia" w:hAnsiTheme="minorHAnsi"/>
-          <w:noProof/>
           <w:kern w:val="2"/>
           <w:sz w:val="24"/>
           <w:szCs w:val="24"/>
-          <w:lang/>
           <w14:ligatures w14:val="standardContextual"/>
         </w:rPr>
       </w:pPr>
@@ -1725,54 +1558,46 @@
         <w:r>
           <w:rPr>
             <w:rStyle w:val="affa"/>
-            <w:noProof/>
           </w:rPr>
           <w:t>4.9 Вимоги до програмної документації</w:t>
         </w:r>
         <w:r>
           <w:rPr>
-            <w:noProof/>
             <w:webHidden/>
           </w:rPr>
           <w:tab/>
         </w:r>
         <w:r>
           <w:rPr>
-            <w:noProof/>
             <w:webHidden/>
           </w:rPr>
           <w:fldChar w:fldCharType="begin"/>
         </w:r>
         <w:r>
           <w:rPr>
-            <w:noProof/>
             <w:webHidden/>
           </w:rPr>
           <w:instrText xml:space="preserve"> PAGEREF _Toc239527190 \h </w:instrText>
         </w:r>
         <w:r>
           <w:rPr>
-            <w:noProof/>
             <w:webHidden/>
           </w:rPr>
         </w:r>
         <w:r>
           <w:rPr>
-            <w:noProof/>
             <w:webHidden/>
           </w:rPr>
           <w:fldChar w:fldCharType="separate"/>
         </w:r>
         <w:r>
           <w:rPr>
-            <w:noProof/>
             <w:webHidden/>
           </w:rPr>
           <w:t>11</w:t>
         </w:r>
         <w:r>
           <w:rPr>
-            <w:noProof/>
             <w:webHidden/>
           </w:rPr>
           <w:fldChar w:fldCharType="end"/>
@@ -1787,11 +1612,9 @@
         </w:tabs>
         <w:rPr>
           <w:rFonts w:asciiTheme="minorHAnsi" w:eastAsiaTheme="minorEastAsia" w:hAnsiTheme="minorHAnsi"/>
-          <w:noProof/>
           <w:kern w:val="2"/>
           <w:sz w:val="24"/>
           <w:szCs w:val="24"/>
-          <w:lang/>
           <w14:ligatures w14:val="standardContextual"/>
         </w:rPr>
       </w:pPr>
@@ -1799,54 +1622,46 @@
         <w:r>
           <w:rPr>
             <w:rStyle w:val="affa"/>
-            <w:noProof/>
           </w:rPr>
           <w:t>5 ТЕХНІКО-ЕКОНОМІЧНІ ПОКАЗНИКИ</w:t>
         </w:r>
         <w:r>
           <w:rPr>
-            <w:noProof/>
             <w:webHidden/>
           </w:rPr>
           <w:tab/>
         </w:r>
         <w:r>
           <w:rPr>
-            <w:noProof/>
             <w:webHidden/>
           </w:rPr>
           <w:fldChar w:fldCharType="begin"/>
         </w:r>
         <w:r>
           <w:rPr>
-            <w:noProof/>
             <w:webHidden/>
           </w:rPr>
           <w:instrText xml:space="preserve"> PAGEREF _Toc239527191 \h </w:instrText>
         </w:r>
         <w:r>
           <w:rPr>
-            <w:noProof/>
             <w:webHidden/>
           </w:rPr>
         </w:r>
         <w:r>
           <w:rPr>
-            <w:noProof/>
             <w:webHidden/>
           </w:rPr>
           <w:fldChar w:fldCharType="separate"/>
         </w:r>
         <w:r>
           <w:rPr>
-            <w:noProof/>
             <w:webHidden/>
           </w:rPr>
           <w:t>12</w:t>
         </w:r>
         <w:r>
           <w:rPr>
-            <w:noProof/>
             <w:webHidden/>
           </w:rPr>
           <w:fldChar w:fldCharType="end"/>
@@ -1861,11 +1676,9 @@
         </w:tabs>
         <w:rPr>
           <w:rFonts w:asciiTheme="minorHAnsi" w:eastAsiaTheme="minorEastAsia" w:hAnsiTheme="minorHAnsi"/>
-          <w:noProof/>
           <w:kern w:val="2"/>
           <w:sz w:val="24"/>
           <w:szCs w:val="24"/>
-          <w:lang/>
           <w14:ligatures w14:val="standardContextual"/>
         </w:rPr>
       </w:pPr>
@@ -1873,54 +1686,46 @@
         <w:r>
           <w:rPr>
             <w:rStyle w:val="affa"/>
-            <w:noProof/>
           </w:rPr>
           <w:t>6 СТАДІЇ ТА ЕТАПИ РОЗРОБКИ</w:t>
         </w:r>
         <w:r>
           <w:rPr>
-            <w:noProof/>
             <w:webHidden/>
           </w:rPr>
           <w:tab/>
         </w:r>
         <w:r>
           <w:rPr>
-            <w:noProof/>
             <w:webHidden/>
           </w:rPr>
           <w:fldChar w:fldCharType="begin"/>
         </w:r>
         <w:r>
           <w:rPr>
-            <w:noProof/>
             <w:webHidden/>
           </w:rPr>
           <w:instrText xml:space="preserve"> PAGEREF _Toc239527192 \h </w:instrText>
         </w:r>
         <w:r>
           <w:rPr>
-            <w:noProof/>
             <w:webHidden/>
           </w:rPr>
         </w:r>
         <w:r>
           <w:rPr>
-            <w:noProof/>
             <w:webHidden/>
           </w:rPr>
           <w:fldChar w:fldCharType="separate"/>
         </w:r>
         <w:r>
           <w:rPr>
-            <w:noProof/>
             <w:webHidden/>
           </w:rPr>
           <w:t>12</w:t>
         </w:r>
         <w:r>
           <w:rPr>
-            <w:noProof/>
             <w:webHidden/>
           </w:rPr>
           <w:fldChar w:fldCharType="end"/>
@@ -1935,11 +1740,9 @@
         </w:tabs>
         <w:rPr>
           <w:rFonts w:asciiTheme="minorHAnsi" w:eastAsiaTheme="minorEastAsia" w:hAnsiTheme="minorHAnsi"/>
-          <w:noProof/>
           <w:kern w:val="2"/>
           <w:sz w:val="24"/>
           <w:szCs w:val="24"/>
-          <w:lang/>
           <w14:ligatures w14:val="standardContextual"/>
         </w:rPr>
       </w:pPr>
@@ -1947,54 +1750,46 @@
         <w:r>
           <w:rPr>
             <w:rStyle w:val="affa"/>
-            <w:noProof/>
           </w:rPr>
           <w:t>7 ПОРЯДОК КОНТРОЛЮ Й ПРИЙМАННЯ</w:t>
         </w:r>
         <w:r>
           <w:rPr>
-            <w:noProof/>
             <w:webHidden/>
           </w:rPr>
           <w:tab/>
         </w:r>
         <w:r>
           <w:rPr>
-            <w:noProof/>
             <w:webHidden/>
           </w:rPr>
           <w:fldChar w:fldCharType="begin"/>
         </w:r>
         <w:r>
           <w:rPr>
-            <w:noProof/>
             <w:webHidden/>
           </w:rPr>
           <w:instrText xml:space="preserve"> PAGEREF _Toc239527193 \h </w:instrText>
         </w:r>
         <w:r>
           <w:rPr>
-            <w:noProof/>
             <w:webHidden/>
           </w:rPr>
         </w:r>
         <w:r>
           <w:rPr>
-            <w:noProof/>
             <w:webHidden/>
           </w:rPr>
           <w:fldChar w:fldCharType="separate"/>
         </w:r>
         <w:r>
           <w:rPr>
-            <w:noProof/>
             <w:webHidden/>
           </w:rPr>
           <w:t>13</w:t>
         </w:r>
         <w:r>
           <w:rPr>
-            <w:noProof/>
             <w:webHidden/>
           </w:rPr>
           <w:fldChar w:fldCharType="end"/>
@@ -2009,11 +1804,9 @@
         </w:tabs>
         <w:rPr>
           <w:rFonts w:asciiTheme="minorHAnsi" w:eastAsiaTheme="minorEastAsia" w:hAnsiTheme="minorHAnsi"/>
-          <w:noProof/>
           <w:kern w:val="2"/>
           <w:sz w:val="24"/>
           <w:szCs w:val="24"/>
-          <w:lang/>
           <w14:ligatures w14:val="standardContextual"/>
         </w:rPr>
       </w:pPr>
@@ -2021,54 +1814,46 @@
         <w:r>
           <w:rPr>
             <w:rStyle w:val="affa"/>
-            <w:noProof/>
           </w:rPr>
           <w:t>ДОДАТОК А (ДОВІДКОВИЙ). РИЗИКИ РОЗРОБКИ ТА СТРАТЕГІЇ МІТИГАЦІЇ</w:t>
         </w:r>
         <w:r>
           <w:rPr>
-            <w:noProof/>
             <w:webHidden/>
           </w:rPr>
           <w:tab/>
         </w:r>
         <w:r>
           <w:rPr>
-            <w:noProof/>
             <w:webHidden/>
           </w:rPr>
           <w:fldChar w:fldCharType="begin"/>
         </w:r>
         <w:r>
           <w:rPr>
-            <w:noProof/>
             <w:webHidden/>
           </w:rPr>
           <w:instrText xml:space="preserve"> PAGEREF _Toc239527194 \h </w:instrText>
         </w:r>
         <w:r>
           <w:rPr>
-            <w:noProof/>
             <w:webHidden/>
           </w:rPr>
         </w:r>
         <w:r>
           <w:rPr>
-            <w:noProof/>
             <w:webHidden/>
           </w:rPr>
           <w:fldChar w:fldCharType="separate"/>
         </w:r>
         <w:r>
           <w:rPr>
-            <w:noProof/>
             <w:webHidden/>
           </w:rPr>
           <w:t>14</w:t>
         </w:r>
         <w:r>
           <w:rPr>
-            <w:noProof/>
             <w:webHidden/>
           </w:rPr>
           <w:fldChar w:fldCharType="end"/>
@@ -2083,11 +1868,9 @@
         </w:tabs>
         <w:rPr>
           <w:rFonts w:asciiTheme="minorHAnsi" w:eastAsiaTheme="minorEastAsia" w:hAnsiTheme="minorHAnsi"/>
-          <w:noProof/>
           <w:kern w:val="2"/>
           <w:sz w:val="24"/>
           <w:szCs w:val="24"/>
-          <w:lang/>
           <w14:ligatures w14:val="standardContextual"/>
         </w:rPr>
       </w:pPr>
@@ -2095,54 +1878,46 @@
         <w:r>
           <w:rPr>
             <w:rStyle w:val="affa"/>
-            <w:noProof/>
           </w:rPr>
           <w:t>ДОДАТОК Б (ДОВІДКОВИЙ). ПРОТОТИП ЕКРАННИХ ФОРМ</w:t>
         </w:r>
         <w:r>
           <w:rPr>
-            <w:noProof/>
             <w:webHidden/>
           </w:rPr>
           <w:tab/>
         </w:r>
         <w:r>
           <w:rPr>
-            <w:noProof/>
             <w:webHidden/>
           </w:rPr>
           <w:fldChar w:fldCharType="begin"/>
         </w:r>
         <w:r>
           <w:rPr>
-            <w:noProof/>
             <w:webHidden/>
           </w:rPr>
           <w:instrText xml:space="preserve"> PAGEREF _Toc239527195 \h </w:instrText>
         </w:r>
         <w:r>
           <w:rPr>
-            <w:noProof/>
             <w:webHidden/>
           </w:rPr>
         </w:r>
         <w:r>
           <w:rPr>
-            <w:noProof/>
             <w:webHidden/>
           </w:rPr>
           <w:fldChar w:fldCharType="separate"/>
         </w:r>
         <w:r>
           <w:rPr>
-            <w:noProof/>
             <w:webHidden/>
           </w:rPr>
           <w:t>15</w:t>
         </w:r>
         <w:r>
           <w:rPr>
-            <w:noProof/>
             <w:webHidden/>
           </w:rPr>
           <w:fldChar w:fldCharType="end"/>
@@ -2249,12 +2024,14 @@
             <w:pPr>
               <w:spacing w:line="240" w:lineRule="auto"/>
             </w:pPr>
+            <w:proofErr w:type="spellStart"/>
             <w:r>
               <w:rPr>
                 <w:sz w:val="24"/>
               </w:rPr>
               <w:t>БпЛА</w:t>
             </w:r>
+            <w:proofErr w:type="spellEnd"/>
           </w:p>
         </w:tc>
         <w:tc>
@@ -2491,7 +2268,21 @@
               <w:rPr>
                 <w:sz w:val="24"/>
               </w:rPr>
-              <w:t>Обчислення підсумкових переліків БпЛА, боєприпасів і цілей за обраний період.</w:t>
+              <w:t xml:space="preserve">Обчислення підсумкових переліків </w:t>
+            </w:r>
+            <w:proofErr w:type="spellStart"/>
+            <w:r>
+              <w:rPr>
+                <w:sz w:val="24"/>
+              </w:rPr>
+              <w:t>БпЛА</w:t>
+            </w:r>
+            <w:proofErr w:type="spellEnd"/>
+            <w:r>
+              <w:rPr>
+                <w:sz w:val="24"/>
+              </w:rPr>
+              <w:t>, боєприпасів і цілей за обраний період.</w:t>
             </w:r>
           </w:p>
         </w:tc>
@@ -2586,7 +2377,21 @@
               <w:rPr>
                 <w:sz w:val="24"/>
               </w:rPr>
-              <w:t>Google Sheets API</w:t>
+              <w:t xml:space="preserve">Google </w:t>
+            </w:r>
+            <w:proofErr w:type="spellStart"/>
+            <w:r>
+              <w:rPr>
+                <w:sz w:val="24"/>
+              </w:rPr>
+              <w:t>Sheets</w:t>
+            </w:r>
+            <w:proofErr w:type="spellEnd"/>
+            <w:r>
+              <w:rPr>
+                <w:sz w:val="24"/>
+              </w:rPr>
+              <w:t xml:space="preserve"> API</w:t>
             </w:r>
           </w:p>
         </w:tc>
@@ -2619,11 +2424,19 @@
             <w:pPr>
               <w:spacing w:line="240" w:lineRule="auto"/>
             </w:pPr>
+            <w:proofErr w:type="spellStart"/>
             <w:r>
               <w:rPr>
                 <w:sz w:val="24"/>
               </w:rPr>
-              <w:t>OAuth 2.0</w:t>
+              <w:t>OAuth</w:t>
+            </w:r>
+            <w:proofErr w:type="spellEnd"/>
+            <w:r>
+              <w:rPr>
+                <w:sz w:val="24"/>
+              </w:rPr>
+              <w:t xml:space="preserve"> 2.0</w:t>
             </w:r>
           </w:p>
         </w:tc>
@@ -2656,12 +2469,14 @@
             <w:pPr>
               <w:spacing w:line="240" w:lineRule="auto"/>
             </w:pPr>
+            <w:proofErr w:type="spellStart"/>
             <w:r>
               <w:rPr>
                 <w:sz w:val="24"/>
               </w:rPr>
               <w:t>SQLite</w:t>
             </w:r>
+            <w:proofErr w:type="spellEnd"/>
           </w:p>
         </w:tc>
         <w:tc>
@@ -2697,8 +2512,16 @@
               <w:rPr>
                 <w:sz w:val="24"/>
               </w:rPr>
-              <w:t>EF Core</w:t>
+              <w:t xml:space="preserve">EF </w:t>
             </w:r>
+            <w:proofErr w:type="spellStart"/>
+            <w:r>
+              <w:rPr>
+                <w:sz w:val="24"/>
+              </w:rPr>
+              <w:t>Core</w:t>
+            </w:r>
+            <w:proofErr w:type="spellEnd"/>
           </w:p>
         </w:tc>
         <w:tc>
@@ -2709,11 +2532,33 @@
             <w:pPr>
               <w:spacing w:line="240" w:lineRule="auto"/>
             </w:pPr>
+            <w:proofErr w:type="spellStart"/>
             <w:r>
               <w:rPr>
                 <w:sz w:val="24"/>
               </w:rPr>
-              <w:t>Entity Framework Core — бібліотека об'єктно-реляційного відображення для .NET.</w:t>
+              <w:t>Entity</w:t>
+            </w:r>
+            <w:proofErr w:type="spellEnd"/>
+            <w:r>
+              <w:rPr>
+                <w:sz w:val="24"/>
+              </w:rPr>
+              <w:t xml:space="preserve"> Framework </w:t>
+            </w:r>
+            <w:proofErr w:type="spellStart"/>
+            <w:r>
+              <w:rPr>
+                <w:sz w:val="24"/>
+              </w:rPr>
+              <w:t>Core</w:t>
+            </w:r>
+            <w:proofErr w:type="spellEnd"/>
+            <w:r>
+              <w:rPr>
+                <w:sz w:val="24"/>
+              </w:rPr>
+              <w:t xml:space="preserve"> — бібліотека об'єктно-реляційного відображення для .NET.</w:t>
             </w:r>
           </w:p>
         </w:tc>
@@ -2730,12 +2575,14 @@
             <w:pPr>
               <w:spacing w:line="240" w:lineRule="auto"/>
             </w:pPr>
+            <w:proofErr w:type="spellStart"/>
             <w:r>
               <w:rPr>
                 <w:sz w:val="24"/>
               </w:rPr>
               <w:t>OpenXML</w:t>
             </w:r>
+            <w:proofErr w:type="spellEnd"/>
           </w:p>
         </w:tc>
         <w:tc>
@@ -2750,7 +2597,35 @@
               <w:rPr>
                 <w:sz w:val="24"/>
               </w:rPr>
-              <w:t>Формат Office Open XML (.docx) та бібліотека для програмного формування документів Word.</w:t>
+              <w:t xml:space="preserve">Формат Office </w:t>
+            </w:r>
+            <w:proofErr w:type="spellStart"/>
+            <w:r>
+              <w:rPr>
+                <w:sz w:val="24"/>
+              </w:rPr>
+              <w:t>Open</w:t>
+            </w:r>
+            <w:proofErr w:type="spellEnd"/>
+            <w:r>
+              <w:rPr>
+                <w:sz w:val="24"/>
+              </w:rPr>
+              <w:t xml:space="preserve"> XML (.</w:t>
+            </w:r>
+            <w:proofErr w:type="spellStart"/>
+            <w:r>
+              <w:rPr>
+                <w:sz w:val="24"/>
+              </w:rPr>
+              <w:t>docx</w:t>
+            </w:r>
+            <w:proofErr w:type="spellEnd"/>
+            <w:r>
+              <w:rPr>
+                <w:sz w:val="24"/>
+              </w:rPr>
+              <w:t>) та бібліотека для програмного формування документів Word.</w:t>
             </w:r>
           </w:p>
         </w:tc>
@@ -2787,7 +2662,21 @@
               <w:rPr>
                 <w:sz w:val="24"/>
               </w:rPr>
-              <w:t>Model–View–ViewModel — архітектурний шаблон розділення інтерфейсу та логіки подання.</w:t>
+              <w:t>Model–View–</w:t>
+            </w:r>
+            <w:proofErr w:type="spellStart"/>
+            <w:r>
+              <w:rPr>
+                <w:sz w:val="24"/>
+              </w:rPr>
+              <w:t>ViewModel</w:t>
+            </w:r>
+            <w:proofErr w:type="spellEnd"/>
+            <w:r>
+              <w:rPr>
+                <w:sz w:val="24"/>
+              </w:rPr>
+              <w:t xml:space="preserve"> — архітектурний шаблон розділення інтерфейсу та логіки подання.</w:t>
             </w:r>
           </w:p>
         </w:tc>
@@ -2824,7 +2713,35 @@
               <w:rPr>
                 <w:sz w:val="24"/>
               </w:rPr>
-              <w:t>Windows Presentation Foundation — технологія побудови настільних інтерфейсів для Windows.</w:t>
+              <w:t xml:space="preserve">Windows </w:t>
+            </w:r>
+            <w:proofErr w:type="spellStart"/>
+            <w:r>
+              <w:rPr>
+                <w:sz w:val="24"/>
+              </w:rPr>
+              <w:t>Presentation</w:t>
+            </w:r>
+            <w:proofErr w:type="spellEnd"/>
+            <w:r>
+              <w:rPr>
+                <w:sz w:val="24"/>
+              </w:rPr>
+              <w:t xml:space="preserve"> </w:t>
+            </w:r>
+            <w:proofErr w:type="spellStart"/>
+            <w:r>
+              <w:rPr>
+                <w:sz w:val="24"/>
+              </w:rPr>
+              <w:t>Foundation</w:t>
+            </w:r>
+            <w:proofErr w:type="spellEnd"/>
+            <w:r>
+              <w:rPr>
+                <w:sz w:val="24"/>
+              </w:rPr>
+              <w:t xml:space="preserve"> — технологія побудови настільних інтерфейсів для Windows.</w:t>
             </w:r>
           </w:p>
         </w:tc>
@@ -2969,7 +2886,15 @@
         <w:jc w:val="both"/>
       </w:pPr>
       <w:r>
-        <w:t>Технічне завдання (далі — ТЗ) встановлює вимоги до програмного продукту «Система формування рапортів про використання БпЛА та боєприпасів» (далі — Система, ПП): призначення, склад функцій, умови експлуатації, стадії розробки, порядок приймання. ТЗ розроблено за ГОСТ 19.106-78.</w:t>
+        <w:t xml:space="preserve">Технічне завдання (далі — ТЗ) встановлює вимоги до програмного продукту «Система формування рапортів про використання </w:t>
+      </w:r>
+      <w:proofErr w:type="spellStart"/>
+      <w:r>
+        <w:t>БпЛА</w:t>
+      </w:r>
+      <w:proofErr w:type="spellEnd"/>
+      <w:r>
+        <w:t xml:space="preserve"> та боєприпасів» (далі — Система, ПП): призначення, склад функцій, умови експлуатації, стадії розробки, порядок приймання. ТЗ розроблено за ГОСТ 19.106-78.</w:t>
       </w:r>
     </w:p>
     <w:p>
@@ -3023,7 +2948,15 @@
         <w:jc w:val="both"/>
       </w:pPr>
       <w:r>
-        <w:t>Повне найменування: «Система формування рапортів про використання БпЛА та боєприпасів».</w:t>
+        <w:t xml:space="preserve">Повне найменування: «Система формування рапортів про використання </w:t>
+      </w:r>
+      <w:proofErr w:type="spellStart"/>
+      <w:r>
+        <w:t>БпЛА</w:t>
+      </w:r>
+      <w:proofErr w:type="spellEnd"/>
+      <w:r>
+        <w:t xml:space="preserve"> та боєприпасів».</w:t>
       </w:r>
     </w:p>
     <w:p>
@@ -3032,7 +2965,15 @@
         <w:jc w:val="both"/>
       </w:pPr>
       <w:r>
-        <w:t>Умовне (робоче) позначення: ReportsWpf.</w:t>
+        <w:t xml:space="preserve">Умовне (робоче) позначення: </w:t>
+      </w:r>
+      <w:proofErr w:type="spellStart"/>
+      <w:r>
+        <w:t>ReportsWpf</w:t>
+      </w:r>
+      <w:proofErr w:type="spellEnd"/>
+      <w:r>
+        <w:t>.</w:t>
       </w:r>
     </w:p>
     <w:p>
@@ -3149,7 +3090,15 @@
         <w:jc w:val="both"/>
       </w:pPr>
       <w:r>
-        <w:t>Режим використання — щоденна робота. Командир формує рапорти за потреби: типово 2–4 рази на місяць, пік — наприкінці звітного періоду. Оператори подають дані після кожного виїзду.</w:t>
+        <w:t xml:space="preserve">Режим використання — щоденна робота. Командир формує рапорти за потреби: </w:t>
+      </w:r>
+      <w:proofErr w:type="spellStart"/>
+      <w:r>
+        <w:t>типово</w:t>
+      </w:r>
+      <w:proofErr w:type="spellEnd"/>
+      <w:r>
+        <w:t xml:space="preserve"> 2–4 рази на місяць, пік — наприкінці звітного періоду. Оператори подають дані після кожного виїзду.</w:t>
       </w:r>
     </w:p>
     <w:p>
@@ -3247,7 +3196,15 @@
         <w:jc w:val="both"/>
       </w:pPr>
       <w:r>
-        <w:t>1. Ведення довідників БпЛА, типів цілей, боєприпасів, населених пунктів і людей: додавання, редагування та видалення записів. Кожен запис довідника містить коротку назву (відображається оператору у формі) та повну назву (підставляється в текст рапорту); для довідника цілей повна назва зберігається у родовому відмінку, для довідника місць друга колонка містить область.</w:t>
+        <w:t xml:space="preserve">1. Ведення довідників </w:t>
+      </w:r>
+      <w:proofErr w:type="spellStart"/>
+      <w:r>
+        <w:t>БпЛА</w:t>
+      </w:r>
+      <w:proofErr w:type="spellEnd"/>
+      <w:r>
+        <w:t>, типів цілей, боєприпасів, населених пунктів і людей: додавання, редагування та видалення записів. Кожен запис довідника містить коротку назву (відображається оператору у формі) та повну назву (підставляється в текст рапорту); для довідника цілей повна назва зберігається у родовому відмінку, для довідника місць друга колонка містить область.</w:t>
       </w:r>
     </w:p>
     <w:p>
@@ -3256,7 +3213,15 @@
         <w:jc w:val="both"/>
       </w:pPr>
       <w:r>
-        <w:t>2. Отримання даних із зовнішнього джерела — імпорт відповідей електронної форми через Google Sheets API. Колонки визначаються за заголовками, а не за порядковими номерами, тому зміна порядку питань у формі не порушує імпорт. Повторний імпорт не створює дублів завдяки стабільному ключу рядка-джерела.</w:t>
+        <w:t xml:space="preserve">2. Отримання даних із зовнішнього джерела — імпорт відповідей електронної форми через Google </w:t>
+      </w:r>
+      <w:proofErr w:type="spellStart"/>
+      <w:r>
+        <w:t>Sheets</w:t>
+      </w:r>
+      <w:proofErr w:type="spellEnd"/>
+      <w:r>
+        <w:t xml:space="preserve"> API. Колонки визначаються за заголовками, а не за порядковими номерами, тому зміна порядку питань у формі не порушує імпорт. Повторний імпорт не створює дублів завдяки стабільному ключу рядка-джерела.</w:t>
       </w:r>
     </w:p>
     <w:p>
@@ -3274,7 +3239,15 @@
         <w:jc w:val="both"/>
       </w:pPr>
       <w:r>
-        <w:t>4. Зведення даних за період — відбір епізодів за межами дат і необов'язковими фільтрами (за оператором, за населеним пунктом); підрахунок сумарної кількості БпЛА за типами; формування унікальних переліків боєприпасів і типів цілей; підстановка областей із довідника місць.</w:t>
+        <w:t xml:space="preserve">4. Зведення даних за період — відбір епізодів за межами дат і необов'язковими фільтрами (за оператором, за населеним пунктом); підрахунок сумарної кількості </w:t>
+      </w:r>
+      <w:proofErr w:type="spellStart"/>
+      <w:r>
+        <w:t>БпЛА</w:t>
+      </w:r>
+      <w:proofErr w:type="spellEnd"/>
+      <w:r>
+        <w:t xml:space="preserve"> за типами; формування унікальних переліків боєприпасів і типів цілей; підстановка областей із довідника місць.</w:t>
       </w:r>
     </w:p>
     <w:p>
@@ -3292,7 +3265,15 @@
         <w:jc w:val="both"/>
       </w:pPr>
       <w:r>
-        <w:t>6. Формування документа рапорту у форматі .docx шляхом заміни тегів у документі-шаблоні обчисленими значеннями.</w:t>
+        <w:t>6. Формування документа рапорту у форматі .</w:t>
+      </w:r>
+      <w:proofErr w:type="spellStart"/>
+      <w:r>
+        <w:t>docx</w:t>
+      </w:r>
+      <w:proofErr w:type="spellEnd"/>
+      <w:r>
+        <w:t xml:space="preserve"> шляхом заміни тегів у документі-шаблоні обчисленими значеннями.</w:t>
       </w:r>
     </w:p>
     <w:p>
@@ -3310,7 +3291,15 @@
         <w:jc w:val="both"/>
       </w:pPr>
       <w:r>
-        <w:t>8. Зворотне вивантаження у зовнішню таблицю — дозапис нових позицій довідників, нових людей та значень колонки «Статус»; наявні рядки не змінюються й не видаляються.</w:t>
+        <w:t xml:space="preserve">8. Зворотне вивантаження у зовнішню таблицю — </w:t>
+      </w:r>
+      <w:proofErr w:type="spellStart"/>
+      <w:r>
+        <w:t>дозапис</w:t>
+      </w:r>
+      <w:proofErr w:type="spellEnd"/>
+      <w:r>
+        <w:t xml:space="preserve"> нових позицій довідників, нових людей та значень колонки «Статус»; наявні рядки не змінюються й не видаляються.</w:t>
       </w:r>
     </w:p>
     <w:p>
@@ -3363,7 +3352,23 @@
         <w:jc w:val="both"/>
       </w:pPr>
       <w:r>
-        <w:t>– відповіді електронної форми — позначка часу, дата виїзду (необов'язкова; за відсутності береться дата подання), адреса електронної пошти оператора, населений пункт, тип БпЛА, тип цілі, кількість БпЛА, до трьох боєприпасів, статус запису;</w:t>
+        <w:t xml:space="preserve">– відповіді електронної форми — позначка часу, дата виїзду (необов'язкова; за відсутності береться дата подання), адреса електронної пошти оператора, населений пункт, тип </w:t>
+      </w:r>
+      <w:proofErr w:type="spellStart"/>
+      <w:r>
+        <w:t>БпЛА</w:t>
+      </w:r>
+      <w:proofErr w:type="spellEnd"/>
+      <w:r>
+        <w:t xml:space="preserve">, тип цілі, кількість </w:t>
+      </w:r>
+      <w:proofErr w:type="spellStart"/>
+      <w:r>
+        <w:t>БпЛА</w:t>
+      </w:r>
+      <w:proofErr w:type="spellEnd"/>
+      <w:r>
+        <w:t>, до трьох боєприпасів, статус запису;</w:t>
       </w:r>
     </w:p>
     <w:p>
@@ -3372,7 +3377,15 @@
         <w:jc w:val="both"/>
       </w:pPr>
       <w:r>
-        <w:t>– довідники — чотири блоки на одному аркуші зовнішньої таблиці (БпЛА, цілі, боєприпаси, місця), дані з третього рядка; ліва колонка блоку — коротка назва, права — повна;</w:t>
+        <w:t>– довідники — чотири блоки на одному аркуші зовнішньої таблиці (</w:t>
+      </w:r>
+      <w:proofErr w:type="spellStart"/>
+      <w:r>
+        <w:t>БпЛА</w:t>
+      </w:r>
+      <w:proofErr w:type="spellEnd"/>
+      <w:r>
+        <w:t>, цілі, боєприпаси, місця), дані з третього рядка; ліва колонка блоку — коротка назва, права — повна;</w:t>
       </w:r>
     </w:p>
     <w:p>
@@ -3390,7 +3403,15 @@
         <w:jc w:val="both"/>
       </w:pPr>
       <w:r>
-        <w:t>Внутрішні дані зберігаються у локальній базі SQLite (таблиці подач, уражень цілей, застосувань боєприпасів, довідників, людей та журналу рапортів).</w:t>
+        <w:t xml:space="preserve">Внутрішні дані зберігаються у локальній базі </w:t>
+      </w:r>
+      <w:proofErr w:type="spellStart"/>
+      <w:r>
+        <w:t>SQLite</w:t>
+      </w:r>
+      <w:proofErr w:type="spellEnd"/>
+      <w:r>
+        <w:t xml:space="preserve"> (таблиці подач, уражень цілей, застосувань боєприпасів, довідників, людей та журналу рапортів).</w:t>
       </w:r>
     </w:p>
     <w:p>
@@ -3408,7 +3429,15 @@
         <w:jc w:val="both"/>
       </w:pPr>
       <w:r>
-        <w:t>– файл рапорту у форматі .docx, оформлений згідно з вимогами підрозділу 4.8;</w:t>
+        <w:t>– файл рапорту у форматі .</w:t>
+      </w:r>
+      <w:proofErr w:type="spellStart"/>
+      <w:r>
+        <w:t>docx</w:t>
+      </w:r>
+      <w:proofErr w:type="spellEnd"/>
+      <w:r>
+        <w:t>, оформлений згідно з вимогами підрозділу 4.8;</w:t>
       </w:r>
     </w:p>
     <w:p>
@@ -3617,7 +3646,15 @@
         <w:jc w:val="both"/>
       </w:pPr>
       <w:r>
-        <w:t>– процесор архітектури x64, не менше 2 ядер;</w:t>
+        <w:t xml:space="preserve">– процесор архітектури x64, не менше 2 </w:t>
+      </w:r>
+      <w:proofErr w:type="spellStart"/>
+      <w:r>
+        <w:t>ядер</w:t>
+      </w:r>
+      <w:proofErr w:type="spellEnd"/>
+      <w:r>
+        <w:t>;</w:t>
       </w:r>
     </w:p>
     <w:p>
@@ -3906,11 +3943,47 @@
             <w:pPr>
               <w:spacing w:line="240" w:lineRule="auto"/>
             </w:pPr>
+            <w:proofErr w:type="spellStart"/>
             <w:r>
               <w:rPr>
                 <w:sz w:val="24"/>
               </w:rPr>
-              <w:t>SQLite, Entity Framework Core 8</w:t>
+              <w:t>SQLite</w:t>
+            </w:r>
+            <w:proofErr w:type="spellEnd"/>
+            <w:r>
+              <w:rPr>
+                <w:sz w:val="24"/>
+              </w:rPr>
+              <w:t xml:space="preserve">, </w:t>
+            </w:r>
+            <w:proofErr w:type="spellStart"/>
+            <w:r>
+              <w:rPr>
+                <w:sz w:val="24"/>
+              </w:rPr>
+              <w:t>Entity</w:t>
+            </w:r>
+            <w:proofErr w:type="spellEnd"/>
+            <w:r>
+              <w:rPr>
+                <w:sz w:val="24"/>
+              </w:rPr>
+              <w:t xml:space="preserve"> Framework </w:t>
+            </w:r>
+            <w:proofErr w:type="spellStart"/>
+            <w:r>
+              <w:rPr>
+                <w:sz w:val="24"/>
+              </w:rPr>
+              <w:t>Core</w:t>
+            </w:r>
+            <w:proofErr w:type="spellEnd"/>
+            <w:r>
+              <w:rPr>
+                <w:sz w:val="24"/>
+              </w:rPr>
+              <w:t xml:space="preserve"> 8</w:t>
             </w:r>
           </w:p>
         </w:tc>
@@ -3959,11 +4032,19 @@
             <w:pPr>
               <w:spacing w:line="240" w:lineRule="auto"/>
             </w:pPr>
+            <w:proofErr w:type="spellStart"/>
             <w:r>
               <w:rPr>
                 <w:sz w:val="24"/>
               </w:rPr>
-              <w:t>DocumentFormat.OpenXml 3.1</w:t>
+              <w:t>DocumentFormat.OpenXml</w:t>
+            </w:r>
+            <w:proofErr w:type="spellEnd"/>
+            <w:r>
+              <w:rPr>
+                <w:sz w:val="24"/>
+              </w:rPr>
+              <w:t xml:space="preserve"> 3.1</w:t>
             </w:r>
           </w:p>
         </w:tc>
@@ -3979,7 +4060,21 @@
               <w:rPr>
                 <w:sz w:val="24"/>
               </w:rPr>
-              <w:t>формування .docx без Microsoft Word</w:t>
+              <w:t>формування .</w:t>
+            </w:r>
+            <w:proofErr w:type="spellStart"/>
+            <w:r>
+              <w:rPr>
+                <w:sz w:val="24"/>
+              </w:rPr>
+              <w:t>docx</w:t>
+            </w:r>
+            <w:proofErr w:type="spellEnd"/>
+            <w:r>
+              <w:rPr>
+                <w:sz w:val="24"/>
+              </w:rPr>
+              <w:t xml:space="preserve"> без Microsoft Word</w:t>
             </w:r>
           </w:p>
         </w:tc>
@@ -4016,7 +4111,35 @@
               <w:rPr>
                 <w:sz w:val="24"/>
               </w:rPr>
-              <w:t>Google Sheets API v4, OAuth 2.0</w:t>
+              <w:t xml:space="preserve">Google </w:t>
+            </w:r>
+            <w:proofErr w:type="spellStart"/>
+            <w:r>
+              <w:rPr>
+                <w:sz w:val="24"/>
+              </w:rPr>
+              <w:t>Sheets</w:t>
+            </w:r>
+            <w:proofErr w:type="spellEnd"/>
+            <w:r>
+              <w:rPr>
+                <w:sz w:val="24"/>
+              </w:rPr>
+              <w:t xml:space="preserve"> API v4, </w:t>
+            </w:r>
+            <w:proofErr w:type="spellStart"/>
+            <w:r>
+              <w:rPr>
+                <w:sz w:val="24"/>
+              </w:rPr>
+              <w:t>OAuth</w:t>
+            </w:r>
+            <w:proofErr w:type="spellEnd"/>
+            <w:r>
+              <w:rPr>
+                <w:sz w:val="24"/>
+              </w:rPr>
+              <w:t xml:space="preserve"> 2.0</w:t>
             </w:r>
           </w:p>
         </w:tc>
@@ -4045,7 +4168,23 @@
         <w:jc w:val="both"/>
       </w:pPr>
       <w:r>
-        <w:t>– формат вихідного документа — Office Open XML (.docx), сумісний з Microsoft Word 2007 та новішими версіями;</w:t>
+        <w:t xml:space="preserve">– формат вихідного документа — Office </w:t>
+      </w:r>
+      <w:proofErr w:type="spellStart"/>
+      <w:r>
+        <w:t>Open</w:t>
+      </w:r>
+      <w:proofErr w:type="spellEnd"/>
+      <w:r>
+        <w:t xml:space="preserve"> XML (.</w:t>
+      </w:r>
+      <w:proofErr w:type="spellStart"/>
+      <w:r>
+        <w:t>docx</w:t>
+      </w:r>
+      <w:proofErr w:type="spellEnd"/>
+      <w:r>
+        <w:t>), сумісний з Microsoft Word 2007 та новішими версіями;</w:t>
       </w:r>
     </w:p>
     <w:p>
@@ -4054,7 +4193,15 @@
         <w:jc w:val="both"/>
       </w:pPr>
       <w:r>
-        <w:t>– формат обміну із зовнішньою таблицею — діапазони у нотації A1 Google Sheets;</w:t>
+        <w:t xml:space="preserve">– формат обміну із зовнішньою таблицею — діапазони у нотації A1 Google </w:t>
+      </w:r>
+      <w:proofErr w:type="spellStart"/>
+      <w:r>
+        <w:t>Sheets</w:t>
+      </w:r>
+      <w:proofErr w:type="spellEnd"/>
+      <w:r>
+        <w:t>;</w:t>
       </w:r>
     </w:p>
     <w:p>
@@ -4063,7 +4210,15 @@
         <w:jc w:val="both"/>
       </w:pPr>
       <w:r>
-        <w:t>– облікові дані OAuth зберігаються локально в теці профілю користувача та не включаються до репозиторію вихідного коду.</w:t>
+        <w:t xml:space="preserve">– облікові дані </w:t>
+      </w:r>
+      <w:proofErr w:type="spellStart"/>
+      <w:r>
+        <w:t>OAuth</w:t>
+      </w:r>
+      <w:proofErr w:type="spellEnd"/>
+      <w:r>
+        <w:t xml:space="preserve"> зберігаються локально в теці профілю користувача та не включаються до репозиторію вихідного коду.</w:t>
       </w:r>
     </w:p>
     <w:p>
@@ -4139,7 +4294,31 @@
         <w:jc w:val="both"/>
       </w:pPr>
       <w:r>
-        <w:t>– сформований рапорт повинен бути оформлений шрифтом Times New Roman 14 пт, з міжрядковим інтервалом 1,5, полями 30/10/20/20 мм, на аркушах формату А4;</w:t>
+        <w:t xml:space="preserve">– сформований рапорт повинен бути оформлений шрифтом </w:t>
+      </w:r>
+      <w:proofErr w:type="spellStart"/>
+      <w:r>
+        <w:t>Times</w:t>
+      </w:r>
+      <w:proofErr w:type="spellEnd"/>
+      <w:r>
+        <w:t xml:space="preserve"> </w:t>
+      </w:r>
+      <w:proofErr w:type="spellStart"/>
+      <w:r>
+        <w:t>New</w:t>
+      </w:r>
+      <w:proofErr w:type="spellEnd"/>
+      <w:r>
+        <w:t xml:space="preserve"> </w:t>
+      </w:r>
+      <w:proofErr w:type="spellStart"/>
+      <w:r>
+        <w:t>Roman</w:t>
+      </w:r>
+      <w:proofErr w:type="spellEnd"/>
+      <w:r>
+        <w:t xml:space="preserve"> 14 пт, з міжрядковим інтервалом 1,5, полями 30/10/20/20 мм, на аркушах формату А4;</w:t>
       </w:r>
     </w:p>
     <w:p>
@@ -4148,7 +4327,15 @@
         <w:jc w:val="both"/>
       </w:pPr>
       <w:r>
-        <w:t>– шаблон рапорту оформлюється як окремий документ .docx із тегами; Система не зберігає відомостей про оформлення й лише замінює теги, тому шаблон можна переверстувати без зміни програмного коду;</w:t>
+        <w:t>– шаблон рапорту оформлюється як окремий документ .</w:t>
+      </w:r>
+      <w:proofErr w:type="spellStart"/>
+      <w:r>
+        <w:t>docx</w:t>
+      </w:r>
+      <w:proofErr w:type="spellEnd"/>
+      <w:r>
+        <w:t xml:space="preserve"> із тегами; Система не зберігає відомостей про оформлення й лише замінює теги, тому шаблон можна переверстувати без зміни програмного коду;</w:t>
       </w:r>
     </w:p>
     <w:p>
@@ -4278,7 +4465,31 @@
         <w:ind w:firstLine="709"/>
       </w:pPr>
       <w:r>
-        <w:t>Вартість розробки нульова: .NET, SQLite, WPF-UI, DocumentFormat.OpenXml і Google Sheets API у межах безкоштовних квот поширюються безкоштовно.</w:t>
+        <w:t xml:space="preserve">Вартість розробки нульова: .NET, </w:t>
+      </w:r>
+      <w:proofErr w:type="spellStart"/>
+      <w:r>
+        <w:t>SQLite</w:t>
+      </w:r>
+      <w:proofErr w:type="spellEnd"/>
+      <w:r>
+        <w:t xml:space="preserve">, WPF-UI, </w:t>
+      </w:r>
+      <w:proofErr w:type="spellStart"/>
+      <w:r>
+        <w:t>DocumentFormat.OpenXml</w:t>
+      </w:r>
+      <w:proofErr w:type="spellEnd"/>
+      <w:r>
+        <w:t xml:space="preserve"> і Google </w:t>
+      </w:r>
+      <w:proofErr w:type="spellStart"/>
+      <w:r>
+        <w:t>Sheets</w:t>
+      </w:r>
+      <w:proofErr w:type="spellEnd"/>
+      <w:r>
+        <w:t xml:space="preserve"> API у межах безкоштовних квот поширюються безкоштовно.</w:t>
       </w:r>
     </w:p>
     <w:p>
@@ -4455,7 +4666,21 @@
               <w:rPr>
                 <w:sz w:val="24"/>
               </w:rPr>
-              <w:t>Ескізний проект: діаграми потоків даних, «сутність–зв'язок», переходів станів; сітковий графік</w:t>
+              <w:t xml:space="preserve">Ескізний </w:t>
+            </w:r>
+            <w:proofErr w:type="spellStart"/>
+            <w:r>
+              <w:rPr>
+                <w:sz w:val="24"/>
+              </w:rPr>
+              <w:t>проект</w:t>
+            </w:r>
+            <w:proofErr w:type="spellEnd"/>
+            <w:r>
+              <w:rPr>
+                <w:sz w:val="24"/>
+              </w:rPr>
+              <w:t>: діаграми потоків даних, «сутність–зв'язок», переходів станів; сітковий графік</w:t>
             </w:r>
           </w:p>
         </w:tc>
@@ -4487,7 +4712,21 @@
               <w:rPr>
                 <w:sz w:val="24"/>
               </w:rPr>
-              <w:t>документ «Ескізний проект»</w:t>
+              <w:t xml:space="preserve">документ «Ескізний </w:t>
+            </w:r>
+            <w:proofErr w:type="spellStart"/>
+            <w:r>
+              <w:rPr>
+                <w:sz w:val="24"/>
+              </w:rPr>
+              <w:t>проект</w:t>
+            </w:r>
+            <w:proofErr w:type="spellEnd"/>
+            <w:r>
+              <w:rPr>
+                <w:sz w:val="24"/>
+              </w:rPr>
+              <w:t>»</w:t>
             </w:r>
           </w:p>
         </w:tc>
@@ -4508,7 +4747,35 @@
               <w:rPr>
                 <w:sz w:val="24"/>
               </w:rPr>
-              <w:t>Технічний проект: структурна та функціональна схеми, структурні карти Константайна й Джексона, специфікації модулів</w:t>
+              <w:t xml:space="preserve">Технічний </w:t>
+            </w:r>
+            <w:proofErr w:type="spellStart"/>
+            <w:r>
+              <w:rPr>
+                <w:sz w:val="24"/>
+              </w:rPr>
+              <w:t>проект</w:t>
+            </w:r>
+            <w:proofErr w:type="spellEnd"/>
+            <w:r>
+              <w:rPr>
+                <w:sz w:val="24"/>
+              </w:rPr>
+              <w:t xml:space="preserve">: структурна та функціональна схеми, структурні карти </w:t>
+            </w:r>
+            <w:proofErr w:type="spellStart"/>
+            <w:r>
+              <w:rPr>
+                <w:sz w:val="24"/>
+              </w:rPr>
+              <w:t>Константайна</w:t>
+            </w:r>
+            <w:proofErr w:type="spellEnd"/>
+            <w:r>
+              <w:rPr>
+                <w:sz w:val="24"/>
+              </w:rPr>
+              <w:t xml:space="preserve"> й Джексона, специфікації модулів</w:t>
             </w:r>
           </w:p>
         </w:tc>
@@ -4540,7 +4807,21 @@
               <w:rPr>
                 <w:sz w:val="24"/>
               </w:rPr>
-              <w:t>документ «Технічний проект»</w:t>
+              <w:t xml:space="preserve">документ «Технічний </w:t>
+            </w:r>
+            <w:proofErr w:type="spellStart"/>
+            <w:r>
+              <w:rPr>
+                <w:sz w:val="24"/>
+              </w:rPr>
+              <w:t>проект</w:t>
+            </w:r>
+            <w:proofErr w:type="spellEnd"/>
+            <w:r>
+              <w:rPr>
+                <w:sz w:val="24"/>
+              </w:rPr>
+              <w:t>»</w:t>
             </w:r>
           </w:p>
         </w:tc>
@@ -4614,7 +4895,21 @@
               <w:rPr>
                 <w:sz w:val="24"/>
               </w:rPr>
-              <w:t>Оцінювання проекту: LOC- та FP-метрики, модель COCOMO II, об'єктно-орієнтовані метрики</w:t>
+              <w:t xml:space="preserve">Оцінювання </w:t>
+            </w:r>
+            <w:proofErr w:type="spellStart"/>
+            <w:r>
+              <w:rPr>
+                <w:sz w:val="24"/>
+              </w:rPr>
+              <w:t>проекту</w:t>
+            </w:r>
+            <w:proofErr w:type="spellEnd"/>
+            <w:r>
+              <w:rPr>
+                <w:sz w:val="24"/>
+              </w:rPr>
+              <w:t>: LOC- та FP-метрики, модель COCOMO II, об'єктно-орієнтовані метрики</w:t>
             </w:r>
           </w:p>
         </w:tc>
@@ -4659,7 +4954,15 @@
         <w:jc w:val="both"/>
       </w:pPr>
       <w:r>
-        <w:t xml:space="preserve">Наступні стадії розвитку продукту (за межами навчального проекту): перехід від зовнішньої таблиці до власного сервера з базою даних; офлайн-подача даних оператором із подальшою синхронізацією; електронний </w:t>
+        <w:t xml:space="preserve">Наступні стадії розвитку продукту (за межами навчального </w:t>
+      </w:r>
+      <w:proofErr w:type="spellStart"/>
+      <w:r>
+        <w:t>проекту</w:t>
+      </w:r>
+      <w:proofErr w:type="spellEnd"/>
+      <w:r>
+        <w:t xml:space="preserve">): перехід від зовнішньої таблиці до власного сервера з базою даних; офлайн-подача даних оператором із подальшою синхронізацією; електронний </w:t>
       </w:r>
       <w:r>
         <w:lastRenderedPageBreak/>
@@ -4705,7 +5008,15 @@
         <w:jc w:val="both"/>
       </w:pPr>
       <w:r>
-        <w:t>– наскрізне випробування ланцюга обробки: наповнення бази → імпорт даних → зведення за період → формування .docx → запис у журнал.</w:t>
+        <w:t>– наскрізне випробування ланцюга обробки: наповнення бази → імпорт даних → зведення за період → формування .</w:t>
+      </w:r>
+      <w:proofErr w:type="spellStart"/>
+      <w:r>
+        <w:t>docx</w:t>
+      </w:r>
+      <w:proofErr w:type="spellEnd"/>
+      <w:r>
+        <w:t xml:space="preserve"> → запис у журнал.</w:t>
       </w:r>
     </w:p>
     <w:p>
@@ -4859,8 +5170,17 @@
                 <w:b/>
                 <w:sz w:val="24"/>
               </w:rPr>
-              <w:t>Стратегія мітигації</w:t>
+              <w:t xml:space="preserve">Стратегія </w:t>
             </w:r>
+            <w:proofErr w:type="spellStart"/>
+            <w:r>
+              <w:rPr>
+                <w:b/>
+                <w:sz w:val="24"/>
+              </w:rPr>
+              <w:t>мітигації</w:t>
+            </w:r>
+            <w:proofErr w:type="spellEnd"/>
           </w:p>
         </w:tc>
       </w:tr>
@@ -5177,7 +5497,21 @@
               <w:rPr>
                 <w:sz w:val="24"/>
               </w:rPr>
-              <w:t>демонстрація на вигаданих даних; перспектива переходу на self-hosted розгортання</w:t>
+              <w:t xml:space="preserve">демонстрація на вигаданих даних; перспектива переходу на </w:t>
+            </w:r>
+            <w:proofErr w:type="spellStart"/>
+            <w:r>
+              <w:rPr>
+                <w:sz w:val="24"/>
+              </w:rPr>
+              <w:t>self-hosted</w:t>
+            </w:r>
+            <w:proofErr w:type="spellEnd"/>
+            <w:r>
+              <w:rPr>
+                <w:sz w:val="24"/>
+              </w:rPr>
+              <w:t xml:space="preserve"> розгортання</w:t>
             </w:r>
           </w:p>
         </w:tc>
@@ -5210,9 +5544,6 @@
         <w:jc w:val="center"/>
       </w:pPr>
       <w:r>
-        <w:rPr>
-          <w:noProof/>
-        </w:rPr>
         <w:drawing>
           <wp:inline distT="0" distB="0" distL="0" distR="0" wp14:anchorId="3BA7F8B7" wp14:editId="35FD60DE">
             <wp:extent cx="5940000" cy="3832258"/>
@@ -5267,9 +5598,6 @@
         <w:jc w:val="center"/>
       </w:pPr>
       <w:r>
-        <w:rPr>
-          <w:noProof/>
-        </w:rPr>
         <w:drawing>
           <wp:inline distT="0" distB="0" distL="0" distR="0" wp14:anchorId="5479FD10" wp14:editId="66EE358A">
             <wp:extent cx="5940000" cy="3832258"/>
@@ -5324,9 +5652,6 @@
         <w:jc w:val="center"/>
       </w:pPr>
       <w:r>
-        <w:rPr>
-          <w:noProof/>
-        </w:rPr>
         <w:lastRenderedPageBreak/>
         <w:drawing>
           <wp:inline distT="0" distB="0" distL="0" distR="0" wp14:anchorId="5B88CA18" wp14:editId="29BDE831">
@@ -5441,7 +5766,6 @@
     </w:r>
     <w:r>
       <w:rPr>
-        <w:noProof/>
         <w:sz w:val="24"/>
       </w:rPr>
       <w:t>2</w:t>
@@ -6080,6 +6404,7 @@
     <w:rPr>
       <w:rFonts w:ascii="Times New Roman" w:eastAsia="Times New Roman" w:hAnsi="Times New Roman"/>
       <w:sz w:val="28"/>
+      <w:lang w:val="uk-UA"/>
     </w:rPr>
   </w:style>
   <w:style w:type="paragraph" w:styleId="1">

</xml_diff>